<commit_message>
adding offline model for embeddings
</commit_message>
<xml_diff>
--- a/documents/recettes.docx
+++ b/documents/recettes.docx
@@ -7,27 +7,36 @@
         <w:rPr>
           <w:b/>
           <w:bCs/>
-          <w:lang w:val="en-CH"/>
         </w:rPr>
       </w:pPr>
       <w:r>
         <w:rPr>
           <w:b/>
           <w:bCs/>
-          <w:lang w:val="en-CH"/>
         </w:rPr>
-        <w:t xml:space="preserve">Burritos au </w:t>
-      </w:r>
-      <w:proofErr w:type="spellStart"/>
+        <w:t>Burritos au bœuf</w:t>
+      </w:r>
+    </w:p>
+    <w:p>
+      <w:pPr>
+        <w:numPr>
+          <w:ilvl w:val="0"/>
+          <w:numId w:val="1"/>
+        </w:numPr>
+      </w:pPr>
+      <w:r>
+        <w:t>Préparation</w:t>
+      </w:r>
+      <w:r>
+        <w:t xml:space="preserve"> </w:t>
+      </w:r>
       <w:r>
         <w:rPr>
           <w:b/>
           <w:bCs/>
-          <w:lang w:val="en-CH"/>
         </w:rPr>
-        <w:t>bœuf</w:t>
-      </w:r>
-      <w:proofErr w:type="spellEnd"/>
+        <w:t>20 min</w:t>
+      </w:r>
     </w:p>
     <w:p>
       <w:pPr>
@@ -35,31 +44,19 @@
           <w:ilvl w:val="0"/>
           <w:numId w:val="1"/>
         </w:numPr>
-        <w:rPr>
-          <w:lang w:val="en-CH"/>
-        </w:rPr>
-      </w:pPr>
-      <w:proofErr w:type="spellStart"/>
-      <w:r>
-        <w:rPr>
-          <w:lang w:val="en-CH"/>
-        </w:rPr>
-        <w:t>Préparation</w:t>
-      </w:r>
-      <w:proofErr w:type="spellEnd"/>
-      <w:r>
-        <w:rPr>
-          <w:lang w:val="en-CH"/>
-        </w:rPr>
+      </w:pPr>
+      <w:r>
+        <w:t>Cuisson</w:t>
+      </w:r>
+      <w:r>
         <w:t xml:space="preserve"> </w:t>
       </w:r>
       <w:r>
         <w:rPr>
           <w:b/>
           <w:bCs/>
-          <w:lang w:val="en-CH"/>
         </w:rPr>
-        <w:t>20 min</w:t>
+        <w:t>12 min</w:t>
       </w:r>
     </w:p>
     <w:p>
@@ -68,214 +65,52 @@
           <w:ilvl w:val="0"/>
           <w:numId w:val="1"/>
         </w:numPr>
-        <w:rPr>
-          <w:lang w:val="en-CH"/>
-        </w:rPr>
-      </w:pPr>
-      <w:proofErr w:type="spellStart"/>
-      <w:r>
-        <w:rPr>
-          <w:lang w:val="en-CH"/>
-        </w:rPr>
-        <w:t>Cuisson</w:t>
-      </w:r>
-      <w:proofErr w:type="spellEnd"/>
-      <w:r>
-        <w:rPr>
-          <w:lang w:val="en-CH"/>
-        </w:rPr>
+      </w:pPr>
+      <w:r>
+        <w:t>Portions</w:t>
+      </w:r>
+      <w:r>
         <w:t xml:space="preserve"> </w:t>
       </w:r>
       <w:r>
         <w:rPr>
           <w:b/>
           <w:bCs/>
-          <w:lang w:val="en-CH"/>
         </w:rPr>
-        <w:t>12 min</w:t>
-      </w:r>
-    </w:p>
-    <w:p>
-      <w:pPr>
-        <w:numPr>
-          <w:ilvl w:val="0"/>
-          <w:numId w:val="1"/>
-        </w:numPr>
-        <w:rPr>
-          <w:lang w:val="en-CH"/>
-        </w:rPr>
-      </w:pPr>
-      <w:r>
-        <w:rPr>
-          <w:lang w:val="en-CH"/>
-        </w:rPr>
-        <w:t>Portions</w:t>
-      </w:r>
-      <w:r>
-        <w:rPr>
-          <w:lang w:val="en-CH"/>
-        </w:rPr>
-        <w:t xml:space="preserve"> </w:t>
-      </w:r>
-      <w:r>
+        <w:t>4</w:t>
+      </w:r>
+    </w:p>
+    <w:p>
+      <w:r>
+        <w:t>Ces burritos sont garnis de bœuf, de haricots noirs, de riz et de beaucoup de fromage! On les fait griller quelques minutes au four pour qu’ils soient encore plus croustillants et on les accompagne de salsa.</w:t>
+      </w:r>
+    </w:p>
+    <w:p/>
+    <w:p>
+      <w:r>
+        <w:t>Sans noix</w:t>
+      </w:r>
+    </w:p>
+    <w:p>
+      <w:r>
+        <w:t>Sans oeufs</w:t>
+      </w:r>
+    </w:p>
+    <w:p/>
+    <w:p>
+      <w:pPr>
         <w:rPr>
           <w:b/>
           <w:bCs/>
-          <w:lang w:val="en-CH"/>
         </w:rPr>
-        <w:t>4</w:t>
-      </w:r>
-    </w:p>
-    <w:p>
-      <w:proofErr w:type="spellStart"/>
-      <w:r>
-        <w:t>Ces</w:t>
-      </w:r>
-      <w:proofErr w:type="spellEnd"/>
-      <w:r>
-        <w:t xml:space="preserve"> burritos </w:t>
-      </w:r>
-      <w:proofErr w:type="spellStart"/>
-      <w:r>
-        <w:t>sont</w:t>
-      </w:r>
-      <w:proofErr w:type="spellEnd"/>
-      <w:r>
-        <w:t xml:space="preserve"> </w:t>
-      </w:r>
-      <w:proofErr w:type="spellStart"/>
-      <w:r>
-        <w:t>garnis</w:t>
-      </w:r>
-      <w:proofErr w:type="spellEnd"/>
-      <w:r>
-        <w:t xml:space="preserve"> de </w:t>
-      </w:r>
-      <w:proofErr w:type="spellStart"/>
-      <w:r>
-        <w:t>bœuf</w:t>
-      </w:r>
-      <w:proofErr w:type="spellEnd"/>
-      <w:r>
-        <w:t xml:space="preserve">, de haricots noirs, de </w:t>
-      </w:r>
-      <w:proofErr w:type="spellStart"/>
-      <w:r>
-        <w:t>riz</w:t>
-      </w:r>
-      <w:proofErr w:type="spellEnd"/>
-      <w:r>
-        <w:t xml:space="preserve"> et de beaucoup de fromage! On les fait griller </w:t>
-      </w:r>
-      <w:proofErr w:type="spellStart"/>
-      <w:r>
-        <w:t>quelques</w:t>
-      </w:r>
-      <w:proofErr w:type="spellEnd"/>
-      <w:r>
-        <w:t xml:space="preserve"> minutes au four pour </w:t>
-      </w:r>
-      <w:proofErr w:type="spellStart"/>
-      <w:r>
-        <w:t>qu’ils</w:t>
-      </w:r>
-      <w:proofErr w:type="spellEnd"/>
-      <w:r>
-        <w:t xml:space="preserve"> </w:t>
-      </w:r>
-      <w:proofErr w:type="spellStart"/>
-      <w:r>
-        <w:t>soient</w:t>
-      </w:r>
-      <w:proofErr w:type="spellEnd"/>
-      <w:r>
-        <w:t xml:space="preserve"> encore plus </w:t>
-      </w:r>
-      <w:proofErr w:type="spellStart"/>
-      <w:r>
-        <w:t>croustillants</w:t>
-      </w:r>
-      <w:proofErr w:type="spellEnd"/>
-      <w:r>
-        <w:t xml:space="preserve"> et on les </w:t>
-      </w:r>
-      <w:proofErr w:type="spellStart"/>
-      <w:r>
-        <w:t>accompagne</w:t>
-      </w:r>
-      <w:proofErr w:type="spellEnd"/>
-      <w:r>
-        <w:t xml:space="preserve"> de salsa.</w:t>
-      </w:r>
-    </w:p>
-    <w:p/>
-    <w:p>
-      <w:pPr>
-        <w:rPr>
-          <w:lang w:val="en-CH"/>
-        </w:rPr>
-      </w:pPr>
-      <w:r>
-        <w:rPr>
-          <w:lang w:val="en-CH"/>
-        </w:rPr>
-        <w:t xml:space="preserve">Sans </w:t>
-      </w:r>
-      <w:proofErr w:type="spellStart"/>
-      <w:r>
-        <w:rPr>
-          <w:lang w:val="en-CH"/>
-        </w:rPr>
-        <w:t>noix</w:t>
-      </w:r>
-      <w:proofErr w:type="spellEnd"/>
-    </w:p>
-    <w:p>
-      <w:pPr>
-        <w:rPr>
-          <w:lang w:val="en-CH"/>
-        </w:rPr>
-      </w:pPr>
-      <w:r>
-        <w:rPr>
-          <w:lang w:val="en-CH"/>
-        </w:rPr>
-        <w:t xml:space="preserve">Sans </w:t>
-      </w:r>
-      <w:proofErr w:type="spellStart"/>
-      <w:r>
-        <w:rPr>
-          <w:lang w:val="en-CH"/>
-        </w:rPr>
-        <w:t>oeufs</w:t>
-      </w:r>
-      <w:proofErr w:type="spellEnd"/>
-    </w:p>
-    <w:p>
-      <w:pPr>
-        <w:rPr>
-          <w:lang w:val="en-CH"/>
-        </w:rPr>
-      </w:pPr>
-    </w:p>
-    <w:p>
-      <w:pPr>
+      </w:pPr>
+      <w:r>
         <w:rPr>
           <w:b/>
           <w:bCs/>
-          <w:lang w:val="en-CH"/>
-        </w:rPr>
-      </w:pPr>
-      <w:proofErr w:type="spellStart"/>
-      <w:r>
-        <w:rPr>
-          <w:b/>
-          <w:bCs/>
-          <w:lang w:val="en-CH"/>
         </w:rPr>
         <w:t>Catégories</w:t>
       </w:r>
-      <w:proofErr w:type="spellEnd"/>
     </w:p>
     <w:p>
       <w:pPr>
@@ -283,15 +118,11 @@
           <w:ilvl w:val="0"/>
           <w:numId w:val="3"/>
         </w:numPr>
-        <w:rPr>
-          <w:lang w:val="en-CH"/>
-        </w:rPr>
       </w:pPr>
       <w:hyperlink r:id="rId5" w:history="1">
         <w:r>
           <w:rPr>
             <w:rStyle w:val="Hyperlink"/>
-            <w:lang w:val="en-CH"/>
           </w:rPr>
           <w:t>Boeuf</w:t>
         </w:r>
@@ -303,15 +134,11 @@
           <w:ilvl w:val="0"/>
           <w:numId w:val="3"/>
         </w:numPr>
-        <w:rPr>
-          <w:lang w:val="en-CH"/>
-        </w:rPr>
       </w:pPr>
       <w:hyperlink r:id="rId6" w:history="1">
         <w:r>
           <w:rPr>
             <w:rStyle w:val="Hyperlink"/>
-            <w:lang w:val="en-CH"/>
           </w:rPr>
           <w:t>30 minutes</w:t>
         </w:r>
@@ -323,15 +150,11 @@
           <w:ilvl w:val="0"/>
           <w:numId w:val="3"/>
         </w:numPr>
-        <w:rPr>
-          <w:lang w:val="en-CH"/>
-        </w:rPr>
       </w:pPr>
       <w:hyperlink r:id="rId7" w:history="1">
         <w:r>
           <w:rPr>
             <w:rStyle w:val="Hyperlink"/>
-            <w:lang w:val="en-CH"/>
           </w:rPr>
           <w:t>Petits prix</w:t>
         </w:r>
@@ -343,15 +166,11 @@
           <w:ilvl w:val="0"/>
           <w:numId w:val="3"/>
         </w:numPr>
-        <w:rPr>
-          <w:lang w:val="en-CH"/>
-        </w:rPr>
       </w:pPr>
       <w:hyperlink r:id="rId8" w:history="1">
         <w:r>
           <w:rPr>
             <w:rStyle w:val="Hyperlink"/>
-            <w:lang w:val="en-CH"/>
           </w:rPr>
           <w:t>Pour enfants</w:t>
         </w:r>
@@ -363,36 +182,14 @@
           <w:ilvl w:val="0"/>
           <w:numId w:val="3"/>
         </w:numPr>
-        <w:rPr>
-          <w:lang w:val="en-CH"/>
-        </w:rPr>
       </w:pPr>
       <w:hyperlink r:id="rId9" w:history="1">
-        <w:proofErr w:type="spellStart"/>
         <w:r>
           <w:rPr>
             <w:rStyle w:val="Hyperlink"/>
-            <w:lang w:val="en-CH"/>
           </w:rPr>
-          <w:t>Recettes</w:t>
+          <w:t>Recettes de semaine</w:t>
         </w:r>
-        <w:proofErr w:type="spellEnd"/>
-        <w:r>
-          <w:rPr>
-            <w:rStyle w:val="Hyperlink"/>
-            <w:lang w:val="en-CH"/>
-          </w:rPr>
-          <w:t xml:space="preserve"> de </w:t>
-        </w:r>
-        <w:proofErr w:type="spellStart"/>
-        <w:r>
-          <w:rPr>
-            <w:rStyle w:val="Hyperlink"/>
-            <w:lang w:val="en-CH"/>
-          </w:rPr>
-          <w:t>semaine</w:t>
-        </w:r>
-        <w:proofErr w:type="spellEnd"/>
       </w:hyperlink>
     </w:p>
     <w:p>
@@ -401,15 +198,11 @@
           <w:ilvl w:val="0"/>
           <w:numId w:val="3"/>
         </w:numPr>
-        <w:rPr>
-          <w:lang w:val="en-CH"/>
-        </w:rPr>
       </w:pPr>
       <w:hyperlink r:id="rId10" w:history="1">
         <w:r>
           <w:rPr>
             <w:rStyle w:val="Hyperlink"/>
-            <w:lang w:val="en-CH"/>
           </w:rPr>
           <w:t>Boeuf</w:t>
         </w:r>
@@ -421,19 +214,15 @@
         <w:rPr>
           <w:b/>
           <w:bCs/>
-          <w:lang w:val="en-CH"/>
         </w:rPr>
       </w:pPr>
-      <w:proofErr w:type="spellStart"/>
       <w:r>
         <w:rPr>
           <w:b/>
           <w:bCs/>
-          <w:lang w:val="en-CH"/>
         </w:rPr>
         <w:t>Ingrédients</w:t>
       </w:r>
-      <w:proofErr w:type="spellEnd"/>
     </w:p>
     <w:p>
       <w:pPr>
@@ -441,38 +230,10 @@
           <w:ilvl w:val="1"/>
           <w:numId w:val="4"/>
         </w:numPr>
-        <w:rPr>
-          <w:lang w:val="en-CH"/>
-        </w:rPr>
-      </w:pPr>
-      <w:r>
-        <w:rPr>
-          <w:lang w:val="en-CH"/>
-        </w:rPr>
-        <w:t xml:space="preserve">180 ml (3/4 tasse) </w:t>
-      </w:r>
-      <w:proofErr w:type="spellStart"/>
-      <w:r>
-        <w:rPr>
-          <w:lang w:val="en-CH"/>
-        </w:rPr>
-        <w:t>d’eau</w:t>
-      </w:r>
-      <w:proofErr w:type="spellEnd"/>
-      <w:r>
-        <w:rPr>
-          <w:lang w:val="en-CH"/>
-        </w:rPr>
-        <w:t xml:space="preserve"> </w:t>
-      </w:r>
-      <w:proofErr w:type="spellStart"/>
-      <w:r>
-        <w:rPr>
-          <w:lang w:val="en-CH"/>
-        </w:rPr>
-        <w:t>froide</w:t>
-      </w:r>
-      <w:proofErr w:type="spellEnd"/>
+      </w:pPr>
+      <w:r>
+        <w:t>180 ml (3/4 tasse) d’eau froide</w:t>
+      </w:r>
     </w:p>
     <w:p>
       <w:pPr>
@@ -480,29 +241,9 @@
           <w:ilvl w:val="1"/>
           <w:numId w:val="4"/>
         </w:numPr>
-        <w:rPr>
-          <w:lang w:val="en-CH"/>
-        </w:rPr>
-      </w:pPr>
-      <w:r>
-        <w:rPr>
-          <w:lang w:val="en-CH"/>
-        </w:rPr>
-        <w:t xml:space="preserve">100 g (1/2 tasse) de </w:t>
-      </w:r>
-      <w:proofErr w:type="spellStart"/>
-      <w:r>
-        <w:rPr>
-          <w:lang w:val="en-CH"/>
-        </w:rPr>
-        <w:t>riz</w:t>
-      </w:r>
-      <w:proofErr w:type="spellEnd"/>
-      <w:r>
-        <w:rPr>
-          <w:lang w:val="en-CH"/>
-        </w:rPr>
-        <w:t xml:space="preserve"> basmati</w:t>
+      </w:pPr>
+      <w:r>
+        <w:t>100 g (1/2 tasse) de riz basmati</w:t>
       </w:r>
     </w:p>
     <w:p>
@@ -511,38 +252,10 @@
           <w:ilvl w:val="1"/>
           <w:numId w:val="4"/>
         </w:numPr>
-        <w:rPr>
-          <w:lang w:val="en-CH"/>
-        </w:rPr>
-      </w:pPr>
-      <w:r>
-        <w:rPr>
-          <w:lang w:val="en-CH"/>
-        </w:rPr>
-        <w:t xml:space="preserve">1ml (1/4 c. à </w:t>
-      </w:r>
-      <w:proofErr w:type="spellStart"/>
-      <w:r>
-        <w:rPr>
-          <w:lang w:val="en-CH"/>
-        </w:rPr>
-        <w:t>thé</w:t>
-      </w:r>
-      <w:proofErr w:type="spellEnd"/>
-      <w:r>
-        <w:rPr>
-          <w:lang w:val="en-CH"/>
-        </w:rPr>
-        <w:t xml:space="preserve">) de </w:t>
-      </w:r>
-      <w:proofErr w:type="spellStart"/>
-      <w:r>
-        <w:rPr>
-          <w:lang w:val="en-CH"/>
-        </w:rPr>
-        <w:t>sel</w:t>
-      </w:r>
-      <w:proofErr w:type="spellEnd"/>
+      </w:pPr>
+      <w:r>
+        <w:t>1ml (1/4 c. à thé) de sel</w:t>
+      </w:r>
     </w:p>
     <w:p>
       <w:pPr>
@@ -550,43 +263,9 @@
           <w:ilvl w:val="1"/>
           <w:numId w:val="4"/>
         </w:numPr>
-        <w:rPr>
-          <w:lang w:val="en-CH"/>
-        </w:rPr>
-      </w:pPr>
-      <w:r>
-        <w:rPr>
-          <w:lang w:val="en-CH"/>
-        </w:rPr>
-        <w:t xml:space="preserve">450 g (1 lb) de </w:t>
-      </w:r>
-      <w:proofErr w:type="spellStart"/>
-      <w:r>
-        <w:rPr>
-          <w:lang w:val="en-CH"/>
-        </w:rPr>
-        <w:t>bœuf</w:t>
-      </w:r>
-      <w:proofErr w:type="spellEnd"/>
-      <w:r>
-        <w:rPr>
-          <w:lang w:val="en-CH"/>
-        </w:rPr>
-        <w:t xml:space="preserve"> </w:t>
-      </w:r>
-      <w:proofErr w:type="spellStart"/>
-      <w:r>
-        <w:rPr>
-          <w:lang w:val="en-CH"/>
-        </w:rPr>
-        <w:t>haché</w:t>
-      </w:r>
-      <w:proofErr w:type="spellEnd"/>
-      <w:r>
-        <w:rPr>
-          <w:lang w:val="en-CH"/>
-        </w:rPr>
-        <w:t xml:space="preserve"> maigre</w:t>
+      </w:pPr>
+      <w:r>
+        <w:t>450 g (1 lb) de bœuf haché maigre</w:t>
       </w:r>
     </w:p>
     <w:p>
@@ -595,38 +274,10 @@
           <w:ilvl w:val="1"/>
           <w:numId w:val="4"/>
         </w:numPr>
-        <w:rPr>
-          <w:lang w:val="en-CH"/>
-        </w:rPr>
-      </w:pPr>
-      <w:r>
-        <w:rPr>
-          <w:lang w:val="en-CH"/>
-        </w:rPr>
-        <w:t xml:space="preserve">15 ml (1 c. à soupe) </w:t>
-      </w:r>
-      <w:proofErr w:type="spellStart"/>
-      <w:r>
-        <w:rPr>
-          <w:lang w:val="en-CH"/>
-        </w:rPr>
-        <w:t>d’huile</w:t>
-      </w:r>
-      <w:proofErr w:type="spellEnd"/>
-      <w:r>
-        <w:rPr>
-          <w:lang w:val="en-CH"/>
-        </w:rPr>
-        <w:t xml:space="preserve"> </w:t>
-      </w:r>
-      <w:proofErr w:type="spellStart"/>
-      <w:r>
-        <w:rPr>
-          <w:lang w:val="en-CH"/>
-        </w:rPr>
-        <w:t>végétale</w:t>
-      </w:r>
-      <w:proofErr w:type="spellEnd"/>
+      </w:pPr>
+      <w:r>
+        <w:t>15 ml (1 c. à soupe) d’huile végétale</w:t>
+      </w:r>
     </w:p>
     <w:p>
       <w:pPr>
@@ -634,52 +285,10 @@
           <w:ilvl w:val="1"/>
           <w:numId w:val="4"/>
         </w:numPr>
-        <w:rPr>
-          <w:lang w:val="en-CH"/>
-        </w:rPr>
-      </w:pPr>
-      <w:r>
-        <w:rPr>
-          <w:lang w:val="en-CH"/>
-        </w:rPr>
-        <w:t xml:space="preserve">1 </w:t>
-      </w:r>
-      <w:proofErr w:type="spellStart"/>
-      <w:r>
-        <w:rPr>
-          <w:lang w:val="en-CH"/>
-        </w:rPr>
-        <w:t>poivron</w:t>
-      </w:r>
-      <w:proofErr w:type="spellEnd"/>
-      <w:r>
-        <w:rPr>
-          <w:lang w:val="en-CH"/>
-        </w:rPr>
-        <w:t xml:space="preserve"> rouge, </w:t>
-      </w:r>
-      <w:proofErr w:type="spellStart"/>
-      <w:r>
-        <w:rPr>
-          <w:lang w:val="en-CH"/>
-        </w:rPr>
-        <w:t>épépiné</w:t>
-      </w:r>
-      <w:proofErr w:type="spellEnd"/>
-      <w:r>
-        <w:rPr>
-          <w:lang w:val="en-CH"/>
-        </w:rPr>
-        <w:t xml:space="preserve"> et </w:t>
-      </w:r>
-      <w:proofErr w:type="spellStart"/>
-      <w:r>
-        <w:rPr>
-          <w:lang w:val="en-CH"/>
-        </w:rPr>
-        <w:t>émincé</w:t>
-      </w:r>
-      <w:proofErr w:type="spellEnd"/>
+      </w:pPr>
+      <w:r>
+        <w:t>1 poivron rouge, épépiné et émincé</w:t>
+      </w:r>
     </w:p>
     <w:p>
       <w:pPr>
@@ -687,52 +296,10 @@
           <w:ilvl w:val="1"/>
           <w:numId w:val="4"/>
         </w:numPr>
-        <w:rPr>
-          <w:lang w:val="en-CH"/>
-        </w:rPr>
-      </w:pPr>
-      <w:r>
-        <w:rPr>
-          <w:lang w:val="en-CH"/>
-        </w:rPr>
-        <w:t xml:space="preserve">1 </w:t>
-      </w:r>
-      <w:proofErr w:type="spellStart"/>
-      <w:r>
-        <w:rPr>
-          <w:lang w:val="en-CH"/>
-        </w:rPr>
-        <w:t>boîte</w:t>
-      </w:r>
-      <w:proofErr w:type="spellEnd"/>
-      <w:r>
-        <w:rPr>
-          <w:lang w:val="en-CH"/>
-        </w:rPr>
-        <w:t xml:space="preserve"> de 398 ml (14 oz) de haricots noirs, </w:t>
-      </w:r>
-      <w:proofErr w:type="spellStart"/>
-      <w:r>
-        <w:rPr>
-          <w:lang w:val="en-CH"/>
-        </w:rPr>
-        <w:t>rincés</w:t>
-      </w:r>
-      <w:proofErr w:type="spellEnd"/>
-      <w:r>
-        <w:rPr>
-          <w:lang w:val="en-CH"/>
-        </w:rPr>
-        <w:t xml:space="preserve"> et </w:t>
-      </w:r>
-      <w:proofErr w:type="spellStart"/>
-      <w:r>
-        <w:rPr>
-          <w:lang w:val="en-CH"/>
-        </w:rPr>
-        <w:t>égouttés</w:t>
-      </w:r>
-      <w:proofErr w:type="spellEnd"/>
+      </w:pPr>
+      <w:r>
+        <w:t>1 boîte de 398 ml (14 oz) de haricots noirs, rincés et égouttés</w:t>
+      </w:r>
     </w:p>
     <w:p>
       <w:pPr>
@@ -740,29 +307,9 @@
           <w:ilvl w:val="1"/>
           <w:numId w:val="4"/>
         </w:numPr>
-        <w:rPr>
-          <w:lang w:val="en-CH"/>
-        </w:rPr>
-      </w:pPr>
-      <w:r>
-        <w:rPr>
-          <w:lang w:val="en-CH"/>
-        </w:rPr>
-        <w:t xml:space="preserve">15 ml (1 c. à soupe) </w:t>
-      </w:r>
-      <w:proofErr w:type="spellStart"/>
-      <w:r>
-        <w:rPr>
-          <w:lang w:val="en-CH"/>
-        </w:rPr>
-        <w:t>d’assaisonnement</w:t>
-      </w:r>
-      <w:proofErr w:type="spellEnd"/>
-      <w:r>
-        <w:rPr>
-          <w:lang w:val="en-CH"/>
-        </w:rPr>
-        <w:t xml:space="preserve"> au chili</w:t>
+      </w:pPr>
+      <w:r>
+        <w:t>15 ml (1 c. à soupe) d’assaisonnement au chili</w:t>
       </w:r>
     </w:p>
     <w:p>
@@ -771,38 +318,10 @@
           <w:ilvl w:val="1"/>
           <w:numId w:val="4"/>
         </w:numPr>
-        <w:rPr>
-          <w:lang w:val="en-CH"/>
-        </w:rPr>
-      </w:pPr>
-      <w:r>
-        <w:rPr>
-          <w:lang w:val="en-CH"/>
-        </w:rPr>
-        <w:t xml:space="preserve">5 ml (1 c. à </w:t>
-      </w:r>
-      <w:proofErr w:type="spellStart"/>
-      <w:r>
-        <w:rPr>
-          <w:lang w:val="en-CH"/>
-        </w:rPr>
-        <w:t>thé</w:t>
-      </w:r>
-      <w:proofErr w:type="spellEnd"/>
-      <w:r>
-        <w:rPr>
-          <w:lang w:val="en-CH"/>
-        </w:rPr>
-        <w:t xml:space="preserve">) de cumin </w:t>
-      </w:r>
-      <w:proofErr w:type="spellStart"/>
-      <w:r>
-        <w:rPr>
-          <w:lang w:val="en-CH"/>
-        </w:rPr>
-        <w:t>moulu</w:t>
-      </w:r>
-      <w:proofErr w:type="spellEnd"/>
+      </w:pPr>
+      <w:r>
+        <w:t>5 ml (1 c. à thé) de cumin moulu</w:t>
+      </w:r>
     </w:p>
     <w:p>
       <w:pPr>
@@ -810,59 +329,14 @@
           <w:ilvl w:val="1"/>
           <w:numId w:val="4"/>
         </w:numPr>
-        <w:rPr>
-          <w:lang w:val="en-CH"/>
-        </w:rPr>
       </w:pPr>
       <w:hyperlink r:id="rId11" w:tgtFrame="_blank" w:history="1">
         <w:r>
           <w:rPr>
             <w:rStyle w:val="Hyperlink"/>
-            <w:lang w:val="en-CH"/>
           </w:rPr>
-          <w:t xml:space="preserve">4 tortillas de </w:t>
+          <w:t>4 tortillas de blé souples de 30 cm (12 po) de diamètre</w:t>
         </w:r>
-        <w:proofErr w:type="spellStart"/>
-        <w:r>
-          <w:rPr>
-            <w:rStyle w:val="Hyperlink"/>
-            <w:lang w:val="en-CH"/>
-          </w:rPr>
-          <w:t>blé</w:t>
-        </w:r>
-        <w:proofErr w:type="spellEnd"/>
-        <w:r>
-          <w:rPr>
-            <w:rStyle w:val="Hyperlink"/>
-            <w:lang w:val="en-CH"/>
-          </w:rPr>
-          <w:t xml:space="preserve"> </w:t>
-        </w:r>
-        <w:proofErr w:type="spellStart"/>
-        <w:r>
-          <w:rPr>
-            <w:rStyle w:val="Hyperlink"/>
-            <w:lang w:val="en-CH"/>
-          </w:rPr>
-          <w:t>souples</w:t>
-        </w:r>
-        <w:proofErr w:type="spellEnd"/>
-        <w:r>
-          <w:rPr>
-            <w:rStyle w:val="Hyperlink"/>
-            <w:lang w:val="en-CH"/>
-          </w:rPr>
-          <w:t xml:space="preserve"> de 30 cm (12 po) de </w:t>
-        </w:r>
-        <w:proofErr w:type="spellStart"/>
-        <w:r>
-          <w:rPr>
-            <w:rStyle w:val="Hyperlink"/>
-            <w:lang w:val="en-CH"/>
-          </w:rPr>
-          <w:t>diamètre</w:t>
-        </w:r>
-        <w:proofErr w:type="spellEnd"/>
       </w:hyperlink>
     </w:p>
     <w:p>
@@ -871,38 +345,10 @@
           <w:ilvl w:val="1"/>
           <w:numId w:val="4"/>
         </w:numPr>
-        <w:rPr>
-          <w:lang w:val="en-CH"/>
-        </w:rPr>
-      </w:pPr>
-      <w:r>
-        <w:rPr>
-          <w:lang w:val="en-CH"/>
-        </w:rPr>
-        <w:t xml:space="preserve">180 g (3 tasses) de </w:t>
-      </w:r>
-      <w:proofErr w:type="spellStart"/>
-      <w:r>
-        <w:rPr>
-          <w:lang w:val="en-CH"/>
-        </w:rPr>
-        <w:t>laitue</w:t>
-      </w:r>
-      <w:proofErr w:type="spellEnd"/>
-      <w:r>
-        <w:rPr>
-          <w:lang w:val="en-CH"/>
-        </w:rPr>
-        <w:t xml:space="preserve"> iceberg </w:t>
-      </w:r>
-      <w:proofErr w:type="spellStart"/>
-      <w:r>
-        <w:rPr>
-          <w:lang w:val="en-CH"/>
-        </w:rPr>
-        <w:t>émincée</w:t>
-      </w:r>
-      <w:proofErr w:type="spellEnd"/>
+      </w:pPr>
+      <w:r>
+        <w:t>180 g (3 tasses) de laitue iceberg émincée</w:t>
+      </w:r>
     </w:p>
     <w:p>
       <w:pPr>
@@ -910,14 +356,8 @@
           <w:ilvl w:val="1"/>
           <w:numId w:val="4"/>
         </w:numPr>
-        <w:rPr>
-          <w:lang w:val="en-CH"/>
-        </w:rPr>
-      </w:pPr>
-      <w:r>
-        <w:rPr>
-          <w:lang w:val="en-CH"/>
-        </w:rPr>
+      </w:pPr>
+      <w:r>
         <w:t>125 ml (1/2 tasse) de salsa, et plus pour le service</w:t>
       </w:r>
     </w:p>
@@ -927,53 +367,11 @@
           <w:ilvl w:val="1"/>
           <w:numId w:val="4"/>
         </w:numPr>
-        <w:rPr>
-          <w:lang w:val="en-CH"/>
-        </w:rPr>
-      </w:pPr>
-      <w:r>
-        <w:rPr>
-          <w:lang w:val="en-CH"/>
-        </w:rPr>
+      </w:pPr>
+      <w:r>
         <w:lastRenderedPageBreak/>
-        <w:t xml:space="preserve">150 g (1 tasse) de grains de </w:t>
-      </w:r>
-      <w:proofErr w:type="spellStart"/>
-      <w:r>
-        <w:rPr>
-          <w:lang w:val="en-CH"/>
-        </w:rPr>
-        <w:t>maïs</w:t>
-      </w:r>
-      <w:proofErr w:type="spellEnd"/>
-      <w:r>
-        <w:rPr>
-          <w:lang w:val="en-CH"/>
-        </w:rPr>
-        <w:t xml:space="preserve"> </w:t>
-      </w:r>
-      <w:proofErr w:type="spellStart"/>
-      <w:r>
-        <w:rPr>
-          <w:lang w:val="en-CH"/>
-        </w:rPr>
-        <w:t>surgelés</w:t>
-      </w:r>
-      <w:proofErr w:type="spellEnd"/>
-      <w:r>
-        <w:rPr>
-          <w:lang w:val="en-CH"/>
-        </w:rPr>
-        <w:t xml:space="preserve">, </w:t>
-      </w:r>
-      <w:proofErr w:type="spellStart"/>
-      <w:r>
-        <w:rPr>
-          <w:lang w:val="en-CH"/>
-        </w:rPr>
-        <w:t>décongelés</w:t>
-      </w:r>
-      <w:proofErr w:type="spellEnd"/>
+        <w:t>150 g (1 tasse) de grains de maïs surgelés, décongelés</w:t>
+      </w:r>
     </w:p>
     <w:p>
       <w:pPr>
@@ -981,38 +379,10 @@
           <w:ilvl w:val="1"/>
           <w:numId w:val="4"/>
         </w:numPr>
-        <w:rPr>
-          <w:lang w:val="en-CH"/>
-        </w:rPr>
-      </w:pPr>
-      <w:r>
-        <w:rPr>
-          <w:lang w:val="en-CH"/>
-        </w:rPr>
-        <w:t xml:space="preserve">150 g (1 1/2 tasse) de fromage </w:t>
-      </w:r>
-      <w:proofErr w:type="spellStart"/>
-      <w:r>
-        <w:rPr>
-          <w:lang w:val="en-CH"/>
-        </w:rPr>
-        <w:t>tex-mex</w:t>
-      </w:r>
-      <w:proofErr w:type="spellEnd"/>
-      <w:r>
-        <w:rPr>
-          <w:lang w:val="en-CH"/>
-        </w:rPr>
-        <w:t xml:space="preserve"> </w:t>
-      </w:r>
-      <w:proofErr w:type="spellStart"/>
-      <w:r>
-        <w:rPr>
-          <w:lang w:val="en-CH"/>
-        </w:rPr>
-        <w:t>râpé</w:t>
-      </w:r>
-      <w:proofErr w:type="spellEnd"/>
+      </w:pPr>
+      <w:r>
+        <w:t>150 g (1 1/2 tasse) de fromage tex-mex râpé</w:t>
+      </w:r>
     </w:p>
     <w:p/>
     <w:p>
@@ -1020,19 +390,15 @@
         <w:rPr>
           <w:b/>
           <w:bCs/>
-          <w:lang w:val="en-CH"/>
         </w:rPr>
       </w:pPr>
-      <w:proofErr w:type="spellStart"/>
       <w:r>
         <w:rPr>
           <w:b/>
           <w:bCs/>
-          <w:lang w:val="en-CH"/>
         </w:rPr>
         <w:t>Préparation</w:t>
       </w:r>
-      <w:proofErr w:type="spellEnd"/>
     </w:p>
     <w:p>
       <w:pPr>
@@ -1040,141 +406,9 @@
           <w:ilvl w:val="1"/>
           <w:numId w:val="5"/>
         </w:numPr>
-        <w:rPr>
-          <w:lang w:val="en-CH"/>
-        </w:rPr>
-      </w:pPr>
-      <w:r>
-        <w:rPr>
-          <w:lang w:val="en-CH"/>
-        </w:rPr>
-        <w:t xml:space="preserve">Dans </w:t>
-      </w:r>
-      <w:proofErr w:type="spellStart"/>
-      <w:r>
-        <w:rPr>
-          <w:lang w:val="en-CH"/>
-        </w:rPr>
-        <w:t>une</w:t>
-      </w:r>
-      <w:proofErr w:type="spellEnd"/>
-      <w:r>
-        <w:rPr>
-          <w:lang w:val="en-CH"/>
-        </w:rPr>
-        <w:t xml:space="preserve"> petite casserole, porter à </w:t>
-      </w:r>
-      <w:proofErr w:type="spellStart"/>
-      <w:r>
-        <w:rPr>
-          <w:lang w:val="en-CH"/>
-        </w:rPr>
-        <w:t>ébullition</w:t>
-      </w:r>
-      <w:proofErr w:type="spellEnd"/>
-      <w:r>
-        <w:rPr>
-          <w:lang w:val="en-CH"/>
-        </w:rPr>
-        <w:t xml:space="preserve"> </w:t>
-      </w:r>
-      <w:proofErr w:type="spellStart"/>
-      <w:r>
-        <w:rPr>
-          <w:lang w:val="en-CH"/>
-        </w:rPr>
-        <w:t>l’eau</w:t>
-      </w:r>
-      <w:proofErr w:type="spellEnd"/>
-      <w:r>
-        <w:rPr>
-          <w:lang w:val="en-CH"/>
-        </w:rPr>
-        <w:t xml:space="preserve">, le </w:t>
-      </w:r>
-      <w:proofErr w:type="spellStart"/>
-      <w:r>
-        <w:rPr>
-          <w:lang w:val="en-CH"/>
-        </w:rPr>
-        <w:t>riz</w:t>
-      </w:r>
-      <w:proofErr w:type="spellEnd"/>
-      <w:r>
-        <w:rPr>
-          <w:lang w:val="en-CH"/>
-        </w:rPr>
-        <w:t xml:space="preserve"> et le sel. </w:t>
-      </w:r>
-      <w:proofErr w:type="spellStart"/>
-      <w:r>
-        <w:rPr>
-          <w:lang w:val="en-CH"/>
-        </w:rPr>
-        <w:t>Couvrir</w:t>
-      </w:r>
-      <w:proofErr w:type="spellEnd"/>
-      <w:r>
-        <w:rPr>
-          <w:lang w:val="en-CH"/>
-        </w:rPr>
-        <w:t xml:space="preserve"> et </w:t>
-      </w:r>
-      <w:proofErr w:type="spellStart"/>
-      <w:r>
-        <w:rPr>
-          <w:lang w:val="en-CH"/>
-        </w:rPr>
-        <w:t>cuire</w:t>
-      </w:r>
-      <w:proofErr w:type="spellEnd"/>
-      <w:r>
-        <w:rPr>
-          <w:lang w:val="en-CH"/>
-        </w:rPr>
-        <w:t xml:space="preserve"> à feu très doux 8 minutes. </w:t>
-      </w:r>
-      <w:proofErr w:type="spellStart"/>
-      <w:r>
-        <w:rPr>
-          <w:lang w:val="en-CH"/>
-        </w:rPr>
-        <w:t>Retirer</w:t>
-      </w:r>
-      <w:proofErr w:type="spellEnd"/>
-      <w:r>
-        <w:rPr>
-          <w:lang w:val="en-CH"/>
-        </w:rPr>
-        <w:t xml:space="preserve"> du feu et </w:t>
-      </w:r>
-      <w:proofErr w:type="spellStart"/>
-      <w:r>
-        <w:rPr>
-          <w:lang w:val="en-CH"/>
-        </w:rPr>
-        <w:t>laisser</w:t>
-      </w:r>
-      <w:proofErr w:type="spellEnd"/>
-      <w:r>
-        <w:rPr>
-          <w:lang w:val="en-CH"/>
-        </w:rPr>
-        <w:t xml:space="preserve"> </w:t>
-      </w:r>
-      <w:proofErr w:type="spellStart"/>
-      <w:r>
-        <w:rPr>
-          <w:lang w:val="en-CH"/>
-        </w:rPr>
-        <w:t>reposer</w:t>
-      </w:r>
-      <w:proofErr w:type="spellEnd"/>
-      <w:r>
-        <w:rPr>
-          <w:lang w:val="en-CH"/>
-        </w:rPr>
-        <w:t xml:space="preserve"> 4 minutes.</w:t>
+      </w:pPr>
+      <w:r>
+        <w:t>Dans une petite casserole, porter à ébullition l’eau, le riz et le sel. Couvrir et cuire à feu très doux 8 minutes. Retirer du feu et laisser reposer 4 minutes.</w:t>
       </w:r>
     </w:p>
     <w:p>
@@ -1183,295 +417,9 @@
           <w:ilvl w:val="1"/>
           <w:numId w:val="5"/>
         </w:numPr>
-        <w:rPr>
-          <w:lang w:val="en-CH"/>
-        </w:rPr>
-      </w:pPr>
-      <w:r>
-        <w:rPr>
-          <w:lang w:val="en-CH"/>
-        </w:rPr>
-        <w:t xml:space="preserve">Entre-temps, dans </w:t>
-      </w:r>
-      <w:proofErr w:type="spellStart"/>
-      <w:r>
-        <w:rPr>
-          <w:lang w:val="en-CH"/>
-        </w:rPr>
-        <w:t>une</w:t>
-      </w:r>
-      <w:proofErr w:type="spellEnd"/>
-      <w:r>
-        <w:rPr>
-          <w:lang w:val="en-CH"/>
-        </w:rPr>
-        <w:t xml:space="preserve"> grande </w:t>
-      </w:r>
-      <w:proofErr w:type="spellStart"/>
-      <w:r>
-        <w:rPr>
-          <w:lang w:val="en-CH"/>
-        </w:rPr>
-        <w:t>poêle</w:t>
-      </w:r>
-      <w:proofErr w:type="spellEnd"/>
-      <w:r>
-        <w:rPr>
-          <w:lang w:val="en-CH"/>
-        </w:rPr>
-        <w:t xml:space="preserve"> </w:t>
-      </w:r>
-      <w:proofErr w:type="spellStart"/>
-      <w:r>
-        <w:rPr>
-          <w:lang w:val="en-CH"/>
-        </w:rPr>
-        <w:t>antiadhésive</w:t>
-      </w:r>
-      <w:proofErr w:type="spellEnd"/>
-      <w:r>
-        <w:rPr>
-          <w:lang w:val="en-CH"/>
-        </w:rPr>
-        <w:t xml:space="preserve"> à feu moyen-</w:t>
-      </w:r>
-      <w:proofErr w:type="spellStart"/>
-      <w:r>
-        <w:rPr>
-          <w:lang w:val="en-CH"/>
-        </w:rPr>
-        <w:t>élevé</w:t>
-      </w:r>
-      <w:proofErr w:type="spellEnd"/>
-      <w:r>
-        <w:rPr>
-          <w:lang w:val="en-CH"/>
-        </w:rPr>
-        <w:t xml:space="preserve">, </w:t>
-      </w:r>
-      <w:proofErr w:type="spellStart"/>
-      <w:r>
-        <w:rPr>
-          <w:lang w:val="en-CH"/>
-        </w:rPr>
-        <w:t>cuire</w:t>
-      </w:r>
-      <w:proofErr w:type="spellEnd"/>
-      <w:r>
-        <w:rPr>
-          <w:lang w:val="en-CH"/>
-        </w:rPr>
-        <w:t xml:space="preserve"> le </w:t>
-      </w:r>
-      <w:proofErr w:type="spellStart"/>
-      <w:r>
-        <w:rPr>
-          <w:lang w:val="en-CH"/>
-        </w:rPr>
-        <w:t>bœuf</w:t>
-      </w:r>
-      <w:proofErr w:type="spellEnd"/>
-      <w:r>
-        <w:rPr>
-          <w:lang w:val="en-CH"/>
-        </w:rPr>
-        <w:t xml:space="preserve"> dans </w:t>
-      </w:r>
-      <w:proofErr w:type="spellStart"/>
-      <w:r>
-        <w:rPr>
-          <w:lang w:val="en-CH"/>
-        </w:rPr>
-        <w:t>l’huile</w:t>
-      </w:r>
-      <w:proofErr w:type="spellEnd"/>
-      <w:r>
-        <w:rPr>
-          <w:lang w:val="en-CH"/>
-        </w:rPr>
-        <w:t xml:space="preserve"> 5 minutes </w:t>
-      </w:r>
-      <w:proofErr w:type="spellStart"/>
-      <w:r>
-        <w:rPr>
-          <w:lang w:val="en-CH"/>
-        </w:rPr>
-        <w:t>en</w:t>
-      </w:r>
-      <w:proofErr w:type="spellEnd"/>
-      <w:r>
-        <w:rPr>
-          <w:lang w:val="en-CH"/>
-        </w:rPr>
-        <w:t xml:space="preserve"> </w:t>
-      </w:r>
-      <w:proofErr w:type="spellStart"/>
-      <w:r>
-        <w:rPr>
-          <w:lang w:val="en-CH"/>
-        </w:rPr>
-        <w:t>l’émiettant</w:t>
-      </w:r>
-      <w:proofErr w:type="spellEnd"/>
-      <w:r>
-        <w:rPr>
-          <w:lang w:val="en-CH"/>
-        </w:rPr>
-        <w:t xml:space="preserve"> à la </w:t>
-      </w:r>
-      <w:proofErr w:type="spellStart"/>
-      <w:r>
-        <w:rPr>
-          <w:lang w:val="en-CH"/>
-        </w:rPr>
-        <w:t>cuillère</w:t>
-      </w:r>
-      <w:proofErr w:type="spellEnd"/>
-      <w:r>
-        <w:rPr>
-          <w:lang w:val="en-CH"/>
-        </w:rPr>
-        <w:t xml:space="preserve"> de </w:t>
-      </w:r>
-      <w:proofErr w:type="spellStart"/>
-      <w:r>
-        <w:rPr>
-          <w:lang w:val="en-CH"/>
-        </w:rPr>
-        <w:t>bois</w:t>
-      </w:r>
-      <w:proofErr w:type="spellEnd"/>
-      <w:r>
-        <w:rPr>
-          <w:lang w:val="en-CH"/>
-        </w:rPr>
-        <w:t xml:space="preserve">. Saler et </w:t>
-      </w:r>
-      <w:proofErr w:type="spellStart"/>
-      <w:r>
-        <w:rPr>
-          <w:lang w:val="en-CH"/>
-        </w:rPr>
-        <w:t>poivrer</w:t>
-      </w:r>
-      <w:proofErr w:type="spellEnd"/>
-      <w:r>
-        <w:rPr>
-          <w:lang w:val="en-CH"/>
-        </w:rPr>
-        <w:t xml:space="preserve">. </w:t>
-      </w:r>
-      <w:proofErr w:type="spellStart"/>
-      <w:r>
-        <w:rPr>
-          <w:lang w:val="en-CH"/>
-        </w:rPr>
-        <w:t>Ajouter</w:t>
-      </w:r>
-      <w:proofErr w:type="spellEnd"/>
-      <w:r>
-        <w:rPr>
-          <w:lang w:val="en-CH"/>
-        </w:rPr>
-        <w:t xml:space="preserve"> le </w:t>
-      </w:r>
-      <w:proofErr w:type="spellStart"/>
-      <w:r>
-        <w:rPr>
-          <w:lang w:val="en-CH"/>
-        </w:rPr>
-        <w:t>poivron</w:t>
-      </w:r>
-      <w:proofErr w:type="spellEnd"/>
-      <w:r>
-        <w:rPr>
-          <w:lang w:val="en-CH"/>
-        </w:rPr>
-        <w:t xml:space="preserve"> et </w:t>
-      </w:r>
-      <w:proofErr w:type="spellStart"/>
-      <w:r>
-        <w:rPr>
-          <w:lang w:val="en-CH"/>
-        </w:rPr>
-        <w:t>poursuivre</w:t>
-      </w:r>
-      <w:proofErr w:type="spellEnd"/>
-      <w:r>
-        <w:rPr>
-          <w:lang w:val="en-CH"/>
-        </w:rPr>
-        <w:t xml:space="preserve"> la </w:t>
-      </w:r>
-      <w:proofErr w:type="spellStart"/>
-      <w:r>
-        <w:rPr>
-          <w:lang w:val="en-CH"/>
-        </w:rPr>
-        <w:t>cuisson</w:t>
-      </w:r>
-      <w:proofErr w:type="spellEnd"/>
-      <w:r>
-        <w:rPr>
-          <w:lang w:val="en-CH"/>
-        </w:rPr>
-        <w:t xml:space="preserve"> 3 minutes. </w:t>
-      </w:r>
-      <w:proofErr w:type="spellStart"/>
-      <w:r>
-        <w:rPr>
-          <w:lang w:val="en-CH"/>
-        </w:rPr>
-        <w:t>Ajouter</w:t>
-      </w:r>
-      <w:proofErr w:type="spellEnd"/>
-      <w:r>
-        <w:rPr>
-          <w:lang w:val="en-CH"/>
-        </w:rPr>
-        <w:t xml:space="preserve"> les haricots noirs et les </w:t>
-      </w:r>
-      <w:proofErr w:type="spellStart"/>
-      <w:r>
-        <w:rPr>
-          <w:lang w:val="en-CH"/>
-        </w:rPr>
-        <w:t>épices</w:t>
-      </w:r>
-      <w:proofErr w:type="spellEnd"/>
-      <w:r>
-        <w:rPr>
-          <w:lang w:val="en-CH"/>
-        </w:rPr>
-        <w:t xml:space="preserve">. Bien </w:t>
-      </w:r>
-      <w:proofErr w:type="spellStart"/>
-      <w:r>
-        <w:rPr>
-          <w:lang w:val="en-CH"/>
-        </w:rPr>
-        <w:t>mélanger</w:t>
-      </w:r>
-      <w:proofErr w:type="spellEnd"/>
-      <w:r>
-        <w:rPr>
-          <w:lang w:val="en-CH"/>
-        </w:rPr>
-        <w:t xml:space="preserve">. Rectifier </w:t>
-      </w:r>
-      <w:proofErr w:type="spellStart"/>
-      <w:r>
-        <w:rPr>
-          <w:lang w:val="en-CH"/>
-        </w:rPr>
-        <w:t>l’assaisonnement</w:t>
-      </w:r>
-      <w:proofErr w:type="spellEnd"/>
-      <w:r>
-        <w:rPr>
-          <w:lang w:val="en-CH"/>
-        </w:rPr>
-        <w:t>.</w:t>
+      </w:pPr>
+      <w:r>
+        <w:t>Entre-temps, dans une grande poêle antiadhésive à feu moyen-élevé, cuire le bœuf dans l’huile 5 minutes en l’émiettant à la cuillère de bois. Saler et poivrer. Ajouter le poivron et poursuivre la cuisson 3 minutes. Ajouter les haricots noirs et les épices. Bien mélanger. Rectifier l’assaisonnement.</w:t>
       </w:r>
     </w:p>
     <w:p>
@@ -1480,365 +428,9 @@
           <w:ilvl w:val="1"/>
           <w:numId w:val="5"/>
         </w:numPr>
-        <w:rPr>
-          <w:lang w:val="en-CH"/>
-        </w:rPr>
-      </w:pPr>
-      <w:r>
-        <w:rPr>
-          <w:lang w:val="en-CH"/>
-        </w:rPr>
-        <w:t xml:space="preserve">Sur un plan de travail, </w:t>
-      </w:r>
-      <w:proofErr w:type="spellStart"/>
-      <w:r>
-        <w:rPr>
-          <w:lang w:val="en-CH"/>
-        </w:rPr>
-        <w:t>déposer</w:t>
-      </w:r>
-      <w:proofErr w:type="spellEnd"/>
-      <w:r>
-        <w:rPr>
-          <w:lang w:val="en-CH"/>
-        </w:rPr>
-        <w:t xml:space="preserve"> les tortillas. </w:t>
-      </w:r>
-      <w:proofErr w:type="spellStart"/>
-      <w:r>
-        <w:rPr>
-          <w:lang w:val="en-CH"/>
-        </w:rPr>
-        <w:t>Répartir</w:t>
-      </w:r>
-      <w:proofErr w:type="spellEnd"/>
-      <w:r>
-        <w:rPr>
-          <w:lang w:val="en-CH"/>
-        </w:rPr>
-        <w:t xml:space="preserve">, </w:t>
-      </w:r>
-      <w:proofErr w:type="spellStart"/>
-      <w:r>
-        <w:rPr>
-          <w:lang w:val="en-CH"/>
-        </w:rPr>
-        <w:t>en</w:t>
-      </w:r>
-      <w:proofErr w:type="spellEnd"/>
-      <w:r>
-        <w:rPr>
-          <w:lang w:val="en-CH"/>
-        </w:rPr>
-        <w:t xml:space="preserve"> </w:t>
-      </w:r>
-      <w:proofErr w:type="spellStart"/>
-      <w:r>
-        <w:rPr>
-          <w:lang w:val="en-CH"/>
-        </w:rPr>
-        <w:t>superposant</w:t>
-      </w:r>
-      <w:proofErr w:type="spellEnd"/>
-      <w:r>
-        <w:rPr>
-          <w:lang w:val="en-CH"/>
-        </w:rPr>
-        <w:t xml:space="preserve">, le </w:t>
-      </w:r>
-      <w:proofErr w:type="spellStart"/>
-      <w:r>
-        <w:rPr>
-          <w:lang w:val="en-CH"/>
-        </w:rPr>
-        <w:t>riz</w:t>
-      </w:r>
-      <w:proofErr w:type="spellEnd"/>
-      <w:r>
-        <w:rPr>
-          <w:lang w:val="en-CH"/>
-        </w:rPr>
-        <w:t xml:space="preserve">, la </w:t>
-      </w:r>
-      <w:proofErr w:type="spellStart"/>
-      <w:r>
-        <w:rPr>
-          <w:lang w:val="en-CH"/>
-        </w:rPr>
-        <w:t>laitue</w:t>
-      </w:r>
-      <w:proofErr w:type="spellEnd"/>
-      <w:r>
-        <w:rPr>
-          <w:lang w:val="en-CH"/>
-        </w:rPr>
-        <w:t xml:space="preserve">, le mélange de </w:t>
-      </w:r>
-      <w:proofErr w:type="spellStart"/>
-      <w:r>
-        <w:rPr>
-          <w:lang w:val="en-CH"/>
-        </w:rPr>
-        <w:t>viande</w:t>
-      </w:r>
-      <w:proofErr w:type="spellEnd"/>
-      <w:r>
-        <w:rPr>
-          <w:lang w:val="en-CH"/>
-        </w:rPr>
-        <w:t xml:space="preserve">, la salsa, le </w:t>
-      </w:r>
-      <w:proofErr w:type="spellStart"/>
-      <w:r>
-        <w:rPr>
-          <w:lang w:val="en-CH"/>
-        </w:rPr>
-        <w:t>maïs</w:t>
-      </w:r>
-      <w:proofErr w:type="spellEnd"/>
-      <w:r>
-        <w:rPr>
-          <w:lang w:val="en-CH"/>
-        </w:rPr>
-        <w:t xml:space="preserve"> et le fromage. Replier les tortillas sur les garnitures de </w:t>
-      </w:r>
-      <w:proofErr w:type="spellStart"/>
-      <w:r>
-        <w:rPr>
-          <w:lang w:val="en-CH"/>
-        </w:rPr>
-        <w:t>chaque</w:t>
-      </w:r>
-      <w:proofErr w:type="spellEnd"/>
-      <w:r>
-        <w:rPr>
-          <w:lang w:val="en-CH"/>
-        </w:rPr>
-        <w:t xml:space="preserve"> </w:t>
-      </w:r>
-      <w:proofErr w:type="spellStart"/>
-      <w:r>
-        <w:rPr>
-          <w:lang w:val="en-CH"/>
-        </w:rPr>
-        <w:t>côté</w:t>
-      </w:r>
-      <w:proofErr w:type="spellEnd"/>
-      <w:r>
-        <w:rPr>
-          <w:lang w:val="en-CH"/>
-        </w:rPr>
-        <w:t xml:space="preserve">, </w:t>
-      </w:r>
-      <w:proofErr w:type="spellStart"/>
-      <w:r>
-        <w:rPr>
-          <w:lang w:val="en-CH"/>
-        </w:rPr>
-        <w:t>puis</w:t>
-      </w:r>
-      <w:proofErr w:type="spellEnd"/>
-      <w:r>
-        <w:rPr>
-          <w:lang w:val="en-CH"/>
-        </w:rPr>
-        <w:t xml:space="preserve"> les </w:t>
-      </w:r>
-      <w:proofErr w:type="spellStart"/>
-      <w:r>
-        <w:rPr>
-          <w:lang w:val="en-CH"/>
-        </w:rPr>
-        <w:t>rouler</w:t>
-      </w:r>
-      <w:proofErr w:type="spellEnd"/>
-      <w:r>
-        <w:rPr>
-          <w:lang w:val="en-CH"/>
-        </w:rPr>
-        <w:t xml:space="preserve"> </w:t>
-      </w:r>
-      <w:proofErr w:type="spellStart"/>
-      <w:r>
-        <w:rPr>
-          <w:lang w:val="en-CH"/>
-        </w:rPr>
-        <w:t>fermement</w:t>
-      </w:r>
-      <w:proofErr w:type="spellEnd"/>
-      <w:r>
-        <w:rPr>
-          <w:lang w:val="en-CH"/>
-        </w:rPr>
-        <w:t xml:space="preserve"> </w:t>
-      </w:r>
-      <w:proofErr w:type="spellStart"/>
-      <w:r>
-        <w:rPr>
-          <w:lang w:val="en-CH"/>
-        </w:rPr>
-        <w:t>en</w:t>
-      </w:r>
-      <w:proofErr w:type="spellEnd"/>
-      <w:r>
-        <w:rPr>
-          <w:lang w:val="en-CH"/>
-        </w:rPr>
-        <w:t xml:space="preserve"> </w:t>
-      </w:r>
-      <w:proofErr w:type="spellStart"/>
-      <w:r>
-        <w:rPr>
-          <w:lang w:val="en-CH"/>
-        </w:rPr>
-        <w:t>emprisonnant</w:t>
-      </w:r>
-      <w:proofErr w:type="spellEnd"/>
-      <w:r>
-        <w:rPr>
-          <w:lang w:val="en-CH"/>
-        </w:rPr>
-        <w:t xml:space="preserve"> les garnitures. </w:t>
-      </w:r>
-      <w:proofErr w:type="spellStart"/>
-      <w:r>
-        <w:rPr>
-          <w:lang w:val="en-CH"/>
-        </w:rPr>
-        <w:t>Retourner</w:t>
-      </w:r>
-      <w:proofErr w:type="spellEnd"/>
-      <w:r>
-        <w:rPr>
-          <w:lang w:val="en-CH"/>
-        </w:rPr>
-        <w:t xml:space="preserve"> les burritos </w:t>
-      </w:r>
-      <w:proofErr w:type="spellStart"/>
-      <w:r>
-        <w:rPr>
-          <w:lang w:val="en-CH"/>
-        </w:rPr>
-        <w:t>afin</w:t>
-      </w:r>
-      <w:proofErr w:type="spellEnd"/>
-      <w:r>
-        <w:rPr>
-          <w:lang w:val="en-CH"/>
-        </w:rPr>
-        <w:t xml:space="preserve"> </w:t>
-      </w:r>
-      <w:proofErr w:type="spellStart"/>
-      <w:r>
-        <w:rPr>
-          <w:lang w:val="en-CH"/>
-        </w:rPr>
-        <w:t>que</w:t>
-      </w:r>
-      <w:proofErr w:type="spellEnd"/>
-      <w:r>
-        <w:rPr>
-          <w:lang w:val="en-CH"/>
-        </w:rPr>
-        <w:t xml:space="preserve"> le joint </w:t>
-      </w:r>
-      <w:proofErr w:type="spellStart"/>
-      <w:r>
-        <w:rPr>
-          <w:lang w:val="en-CH"/>
-        </w:rPr>
-        <w:t>soit</w:t>
-      </w:r>
-      <w:proofErr w:type="spellEnd"/>
-      <w:r>
-        <w:rPr>
-          <w:lang w:val="en-CH"/>
-        </w:rPr>
-        <w:t xml:space="preserve"> </w:t>
-      </w:r>
-      <w:proofErr w:type="spellStart"/>
-      <w:r>
-        <w:rPr>
-          <w:lang w:val="en-CH"/>
-        </w:rPr>
-        <w:t>en</w:t>
-      </w:r>
-      <w:proofErr w:type="spellEnd"/>
-      <w:r>
-        <w:rPr>
-          <w:lang w:val="en-CH"/>
-        </w:rPr>
-        <w:t xml:space="preserve"> dessous (voir note). Couper </w:t>
-      </w:r>
-      <w:proofErr w:type="spellStart"/>
-      <w:r>
-        <w:rPr>
-          <w:lang w:val="en-CH"/>
-        </w:rPr>
-        <w:t>en</w:t>
-      </w:r>
-      <w:proofErr w:type="spellEnd"/>
-      <w:r>
-        <w:rPr>
-          <w:lang w:val="en-CH"/>
-        </w:rPr>
-        <w:t xml:space="preserve"> deux. </w:t>
-      </w:r>
-      <w:proofErr w:type="spellStart"/>
-      <w:r>
-        <w:rPr>
-          <w:lang w:val="en-CH"/>
-        </w:rPr>
-        <w:t>Servir</w:t>
-      </w:r>
-      <w:proofErr w:type="spellEnd"/>
-      <w:r>
-        <w:rPr>
-          <w:lang w:val="en-CH"/>
-        </w:rPr>
-        <w:t xml:space="preserve"> et </w:t>
-      </w:r>
-      <w:proofErr w:type="spellStart"/>
-      <w:r>
-        <w:rPr>
-          <w:lang w:val="en-CH"/>
-        </w:rPr>
-        <w:t>accompagner</w:t>
-      </w:r>
-      <w:proofErr w:type="spellEnd"/>
-      <w:r>
-        <w:rPr>
-          <w:lang w:val="en-CH"/>
-        </w:rPr>
-        <w:t xml:space="preserve"> de salsa, </w:t>
-      </w:r>
-      <w:proofErr w:type="spellStart"/>
-      <w:r>
-        <w:rPr>
-          <w:lang w:val="en-CH"/>
-        </w:rPr>
-        <w:t>si</w:t>
-      </w:r>
-      <w:proofErr w:type="spellEnd"/>
-      <w:r>
-        <w:rPr>
-          <w:lang w:val="en-CH"/>
-        </w:rPr>
-        <w:t xml:space="preserve"> </w:t>
-      </w:r>
-      <w:proofErr w:type="spellStart"/>
-      <w:r>
-        <w:rPr>
-          <w:lang w:val="en-CH"/>
-        </w:rPr>
-        <w:t>désiré</w:t>
-      </w:r>
-      <w:proofErr w:type="spellEnd"/>
-      <w:r>
-        <w:rPr>
-          <w:lang w:val="en-CH"/>
-        </w:rPr>
-        <w:t>.</w:t>
+      </w:pPr>
+      <w:r>
+        <w:t>Sur un plan de travail, déposer les tortillas. Répartir, en superposant, le riz, la laitue, le mélange de viande, la salsa, le maïs et le fromage. Replier les tortillas sur les garnitures de chaque côté, puis les rouler fermement en emprisonnant les garnitures. Retourner les burritos afin que le joint soit en dessous (voir note). Couper en deux. Servir et accompagner de salsa, si désiré.</w:t>
       </w:r>
     </w:p>
     <w:p/>
@@ -3220,6 +1812,7 @@
   <w:style w:type="character" w:default="1" w:styleId="DefaultParagraphFont">
     <w:name w:val="Default Paragraph Font"/>
     <w:uiPriority w:val="1"/>
+    <w:semiHidden/>
     <w:unhideWhenUsed/>
   </w:style>
   <w:style w:type="table" w:default="1" w:styleId="TableNormal">

</xml_diff>